<commit_message>
add EH & PT files and create lab manual
</commit_message>
<xml_diff>
--- a/Sem-3/CSF & NS (Cybersecurity Fundamentals & Network Security)/MCA_CSF&NS_Lab Manual.docx
+++ b/Sem-3/CSF & NS (Cybersecurity Fundamentals & Network Security)/MCA_CSF&NS_Lab Manual.docx
@@ -602,7 +602,7 @@
           <w:i/>
           <w:color w:val="000000"/>
         </w:rPr>
-        <w:t xml:space="preserve">has successfully completed his/her laboratory experiments in the </w:t>
+        <w:t xml:space="preserve">has successfully completed his laboratory experiments in the </w:t>
       </w:r>
       <w:r>
         <w:rPr>
@@ -878,10 +878,10 @@
       </w:tblPr>
       <w:tblGrid>
         <w:gridCol w:w="567"/>
-        <w:gridCol w:w="4678"/>
+        <w:gridCol w:w="5245"/>
         <w:gridCol w:w="851"/>
-        <w:gridCol w:w="1813"/>
-        <w:gridCol w:w="1447"/>
+        <w:gridCol w:w="1417"/>
+        <w:gridCol w:w="1276"/>
         <w:gridCol w:w="1343"/>
       </w:tblGrid>
       <w:tr>
@@ -928,7 +928,7 @@
         </w:tc>
         <w:tc>
           <w:tcPr>
-            <w:tcW w:w="4678" w:type="dxa"/>
+            <w:tcW w:w="5245" w:type="dxa"/>
             <w:tcMar>
               <w:top w:w="100" w:type="dxa"/>
               <w:left w:w="100" w:type="dxa"/>
@@ -983,7 +983,7 @@
         </w:tc>
         <w:tc>
           <w:tcPr>
-            <w:tcW w:w="1813" w:type="dxa"/>
+            <w:tcW w:w="1417" w:type="dxa"/>
             <w:vAlign w:val="center"/>
           </w:tcPr>
           <w:p>
@@ -1008,7 +1008,7 @@
         </w:tc>
         <w:tc>
           <w:tcPr>
-            <w:tcW w:w="1447" w:type="dxa"/>
+            <w:tcW w:w="1276" w:type="dxa"/>
             <w:vAlign w:val="center"/>
           </w:tcPr>
           <w:p>
@@ -1094,7 +1094,7 @@
         </w:tc>
         <w:tc>
           <w:tcPr>
-            <w:tcW w:w="4678" w:type="dxa"/>
+            <w:tcW w:w="5245" w:type="dxa"/>
             <w:tcMar>
               <w:top w:w="100" w:type="dxa"/>
               <w:left w:w="100" w:type="dxa"/>
@@ -1113,24 +1113,21 @@
             </w:pPr>
             <w:r>
               <w:rPr>
-                <w:rFonts w:ascii="Times New Roman" w:eastAsia="SimSun" w:hAnsi="Times New Roman" w:cs="Times New Roman"/>
-                <w:color w:val="000000"/>
+                <w:rFonts w:ascii="Times New Roman" w:hAnsi="Times New Roman" w:cs="Times New Roman"/>
+                <w:bCs/>
+                <w:sz w:val="26"/>
+                <w:szCs w:val="26"/>
               </w:rPr>
-              <w:t>Wireshark</w:t>
+              <w:t>To capture the live network traffic using Wireshark and apply a display filter to identify HTTP credentials</w:t>
             </w:r>
             <w:r>
               <w:rPr>
-                <w:rFonts w:ascii="Times New Roman" w:eastAsia="SimSun" w:hAnsi="Times New Roman" w:cs="Times New Roman"/>
-                <w:color w:val="000000"/>
+                <w:rFonts w:ascii="Times New Roman" w:hAnsi="Times New Roman" w:cs="Times New Roman"/>
+                <w:bCs/>
+                <w:sz w:val="26"/>
+                <w:szCs w:val="26"/>
               </w:rPr>
-              <w:t xml:space="preserve">: </w:t>
-            </w:r>
-            <w:r>
-              <w:rPr>
-                <w:rFonts w:ascii="Times New Roman" w:eastAsia="SimSun" w:hAnsi="Times New Roman" w:cs="Times New Roman"/>
-                <w:color w:val="000000"/>
-              </w:rPr>
-              <w:t>HTTP Traffic Analysis</w:t>
+              <w:t>.</w:t>
             </w:r>
           </w:p>
         </w:tc>
@@ -1158,7 +1155,7 @@
         </w:tc>
         <w:tc>
           <w:tcPr>
-            <w:tcW w:w="1813" w:type="dxa"/>
+            <w:tcW w:w="1417" w:type="dxa"/>
           </w:tcPr>
           <w:p>
             <w:pPr>
@@ -1172,7 +1169,7 @@
         </w:tc>
         <w:tc>
           <w:tcPr>
-            <w:tcW w:w="1447" w:type="dxa"/>
+            <w:tcW w:w="1276" w:type="dxa"/>
           </w:tcPr>
           <w:p>
             <w:pPr>
@@ -1228,7 +1225,7 @@
         </w:tc>
         <w:tc>
           <w:tcPr>
-            <w:tcW w:w="4678" w:type="dxa"/>
+            <w:tcW w:w="5245" w:type="dxa"/>
             <w:tcMar>
               <w:top w:w="100" w:type="dxa"/>
               <w:left w:w="100" w:type="dxa"/>
@@ -1263,7 +1260,7 @@
         </w:tc>
         <w:tc>
           <w:tcPr>
-            <w:tcW w:w="1813" w:type="dxa"/>
+            <w:tcW w:w="1417" w:type="dxa"/>
           </w:tcPr>
           <w:p>
             <w:pPr>
@@ -1277,7 +1274,7 @@
         </w:tc>
         <w:tc>
           <w:tcPr>
-            <w:tcW w:w="1447" w:type="dxa"/>
+            <w:tcW w:w="1276" w:type="dxa"/>
           </w:tcPr>
           <w:p>
             <w:pPr>
@@ -1333,7 +1330,7 @@
         </w:tc>
         <w:tc>
           <w:tcPr>
-            <w:tcW w:w="4678" w:type="dxa"/>
+            <w:tcW w:w="5245" w:type="dxa"/>
             <w:tcMar>
               <w:top w:w="100" w:type="dxa"/>
               <w:left w:w="100" w:type="dxa"/>
@@ -1368,7 +1365,7 @@
         </w:tc>
         <w:tc>
           <w:tcPr>
-            <w:tcW w:w="1813" w:type="dxa"/>
+            <w:tcW w:w="1417" w:type="dxa"/>
           </w:tcPr>
           <w:p>
             <w:pPr>
@@ -1382,7 +1379,7 @@
         </w:tc>
         <w:tc>
           <w:tcPr>
-            <w:tcW w:w="1447" w:type="dxa"/>
+            <w:tcW w:w="1276" w:type="dxa"/>
           </w:tcPr>
           <w:p>
             <w:pPr>
@@ -1438,7 +1435,7 @@
         </w:tc>
         <w:tc>
           <w:tcPr>
-            <w:tcW w:w="4678" w:type="dxa"/>
+            <w:tcW w:w="5245" w:type="dxa"/>
             <w:tcMar>
               <w:top w:w="100" w:type="dxa"/>
               <w:left w:w="100" w:type="dxa"/>
@@ -1473,7 +1470,7 @@
         </w:tc>
         <w:tc>
           <w:tcPr>
-            <w:tcW w:w="1813" w:type="dxa"/>
+            <w:tcW w:w="1417" w:type="dxa"/>
           </w:tcPr>
           <w:p>
             <w:pPr>
@@ -1487,7 +1484,7 @@
         </w:tc>
         <w:tc>
           <w:tcPr>
-            <w:tcW w:w="1447" w:type="dxa"/>
+            <w:tcW w:w="1276" w:type="dxa"/>
           </w:tcPr>
           <w:p>
             <w:pPr>
@@ -1543,7 +1540,7 @@
         </w:tc>
         <w:tc>
           <w:tcPr>
-            <w:tcW w:w="4678" w:type="dxa"/>
+            <w:tcW w:w="5245" w:type="dxa"/>
             <w:tcMar>
               <w:top w:w="100" w:type="dxa"/>
               <w:left w:w="100" w:type="dxa"/>
@@ -1578,7 +1575,7 @@
         </w:tc>
         <w:tc>
           <w:tcPr>
-            <w:tcW w:w="1813" w:type="dxa"/>
+            <w:tcW w:w="1417" w:type="dxa"/>
           </w:tcPr>
           <w:p>
             <w:pPr>
@@ -1592,7 +1589,7 @@
         </w:tc>
         <w:tc>
           <w:tcPr>
-            <w:tcW w:w="1447" w:type="dxa"/>
+            <w:tcW w:w="1276" w:type="dxa"/>
           </w:tcPr>
           <w:p>
             <w:pPr>
@@ -1648,7 +1645,7 @@
         </w:tc>
         <w:tc>
           <w:tcPr>
-            <w:tcW w:w="4678" w:type="dxa"/>
+            <w:tcW w:w="5245" w:type="dxa"/>
             <w:tcMar>
               <w:top w:w="100" w:type="dxa"/>
               <w:left w:w="100" w:type="dxa"/>
@@ -1683,7 +1680,7 @@
         </w:tc>
         <w:tc>
           <w:tcPr>
-            <w:tcW w:w="1813" w:type="dxa"/>
+            <w:tcW w:w="1417" w:type="dxa"/>
           </w:tcPr>
           <w:p>
             <w:pPr>
@@ -1697,7 +1694,7 @@
         </w:tc>
         <w:tc>
           <w:tcPr>
-            <w:tcW w:w="1447" w:type="dxa"/>
+            <w:tcW w:w="1276" w:type="dxa"/>
           </w:tcPr>
           <w:p>
             <w:pPr>
@@ -1753,7 +1750,7 @@
         </w:tc>
         <w:tc>
           <w:tcPr>
-            <w:tcW w:w="4678" w:type="dxa"/>
+            <w:tcW w:w="5245" w:type="dxa"/>
             <w:tcMar>
               <w:top w:w="100" w:type="dxa"/>
               <w:left w:w="100" w:type="dxa"/>
@@ -1788,7 +1785,7 @@
         </w:tc>
         <w:tc>
           <w:tcPr>
-            <w:tcW w:w="1813" w:type="dxa"/>
+            <w:tcW w:w="1417" w:type="dxa"/>
           </w:tcPr>
           <w:p>
             <w:pPr>
@@ -1802,7 +1799,7 @@
         </w:tc>
         <w:tc>
           <w:tcPr>
-            <w:tcW w:w="1447" w:type="dxa"/>
+            <w:tcW w:w="1276" w:type="dxa"/>
           </w:tcPr>
           <w:p>
             <w:pPr>
@@ -1858,7 +1855,7 @@
         </w:tc>
         <w:tc>
           <w:tcPr>
-            <w:tcW w:w="4678" w:type="dxa"/>
+            <w:tcW w:w="5245" w:type="dxa"/>
             <w:tcMar>
               <w:top w:w="100" w:type="dxa"/>
               <w:left w:w="100" w:type="dxa"/>
@@ -1893,7 +1890,7 @@
         </w:tc>
         <w:tc>
           <w:tcPr>
-            <w:tcW w:w="1813" w:type="dxa"/>
+            <w:tcW w:w="1417" w:type="dxa"/>
           </w:tcPr>
           <w:p>
             <w:pPr>
@@ -1907,7 +1904,7 @@
         </w:tc>
         <w:tc>
           <w:tcPr>
-            <w:tcW w:w="1447" w:type="dxa"/>
+            <w:tcW w:w="1276" w:type="dxa"/>
           </w:tcPr>
           <w:p>
             <w:pPr>
@@ -1963,7 +1960,7 @@
         </w:tc>
         <w:tc>
           <w:tcPr>
-            <w:tcW w:w="4678" w:type="dxa"/>
+            <w:tcW w:w="5245" w:type="dxa"/>
             <w:tcMar>
               <w:top w:w="100" w:type="dxa"/>
               <w:left w:w="100" w:type="dxa"/>
@@ -1998,7 +1995,7 @@
         </w:tc>
         <w:tc>
           <w:tcPr>
-            <w:tcW w:w="1813" w:type="dxa"/>
+            <w:tcW w:w="1417" w:type="dxa"/>
           </w:tcPr>
           <w:p>
             <w:pPr>
@@ -2012,7 +2009,7 @@
         </w:tc>
         <w:tc>
           <w:tcPr>
-            <w:tcW w:w="1447" w:type="dxa"/>
+            <w:tcW w:w="1276" w:type="dxa"/>
           </w:tcPr>
           <w:p>
             <w:pPr>
@@ -2074,7 +2071,7 @@
         </w:tc>
         <w:tc>
           <w:tcPr>
-            <w:tcW w:w="4678" w:type="dxa"/>
+            <w:tcW w:w="5245" w:type="dxa"/>
             <w:tcBorders>
               <w:top w:val="single" w:sz="8" w:space="0" w:color="000000"/>
               <w:left w:val="single" w:sz="8" w:space="0" w:color="000000"/>
@@ -2121,7 +2118,7 @@
         </w:tc>
         <w:tc>
           <w:tcPr>
-            <w:tcW w:w="1813" w:type="dxa"/>
+            <w:tcW w:w="1417" w:type="dxa"/>
             <w:tcBorders>
               <w:top w:val="single" w:sz="8" w:space="0" w:color="000000"/>
               <w:left w:val="single" w:sz="8" w:space="0" w:color="000000"/>
@@ -2141,7 +2138,7 @@
         </w:tc>
         <w:tc>
           <w:tcPr>
-            <w:tcW w:w="1447" w:type="dxa"/>
+            <w:tcW w:w="1276" w:type="dxa"/>
             <w:tcBorders>
               <w:top w:val="single" w:sz="8" w:space="0" w:color="000000"/>
               <w:left w:val="single" w:sz="8" w:space="0" w:color="000000"/>
@@ -2645,9 +2642,11 @@
           <w:rFonts w:ascii="Times New Roman" w:hAnsi="Times New Roman" w:cs="Times New Roman"/>
           <w:b/>
           <w:bCs/>
+          <w:noProof/>
           <w:sz w:val="24"/>
           <w:szCs w:val="24"/>
         </w:rPr>
+        <w:lastRenderedPageBreak/>
         <w:drawing>
           <wp:inline distT="0" distB="0" distL="0" distR="0" wp14:anchorId="24C18A9B" wp14:editId="033B5FF3">
             <wp:extent cx="5943600" cy="3343275"/>
@@ -2721,7 +2720,6 @@
           <w:sz w:val="26"/>
           <w:szCs w:val="26"/>
         </w:rPr>
-        <w:lastRenderedPageBreak/>
         <w:t>Explanation:</w:t>
       </w:r>
       <w:r>
@@ -2822,27 +2820,7 @@
           <w:sz w:val="28"/>
           <w:szCs w:val="28"/>
         </w:rPr>
-        <w:t>Step 2</w:t>
-      </w:r>
-      <w:r>
-        <w:rPr>
-          <w:rFonts w:ascii="Times New Roman" w:hAnsi="Times New Roman" w:cs="Times New Roman"/>
-          <w:b/>
-          <w:bCs/>
-          <w:sz w:val="28"/>
-          <w:szCs w:val="28"/>
-        </w:rPr>
-        <w:t xml:space="preserve">: </w:t>
-      </w:r>
-      <w:r>
-        <w:rPr>
-          <w:rFonts w:ascii="Times New Roman" w:hAnsi="Times New Roman" w:cs="Times New Roman"/>
-          <w:b/>
-          <w:bCs/>
-          <w:sz w:val="28"/>
-          <w:szCs w:val="28"/>
-        </w:rPr>
-        <w:t>Start Packet Capture</w:t>
+        <w:t>Step 2: Start Packet Capture</w:t>
       </w:r>
     </w:p>
     <w:p>
@@ -2887,9 +2865,11 @@
       <w:r>
         <w:rPr>
           <w:rFonts w:ascii="Times New Roman" w:hAnsi="Times New Roman" w:cs="Times New Roman"/>
-          <w:sz w:val="26"/>
-          <w:szCs w:val="26"/>
-        </w:rPr>
+          <w:noProof/>
+          <w:sz w:val="26"/>
+          <w:szCs w:val="26"/>
+        </w:rPr>
+        <w:lastRenderedPageBreak/>
         <w:drawing>
           <wp:inline distT="0" distB="0" distL="0" distR="0" wp14:anchorId="30DF7E8B" wp14:editId="1EFF8133">
             <wp:extent cx="5943600" cy="3343275"/>
@@ -3079,145 +3059,116 @@
           <w:sz w:val="28"/>
           <w:szCs w:val="28"/>
         </w:rPr>
-        <w:t>Step 3</w:t>
+        <w:t>Step 3: Visit HTTP Site</w:t>
+      </w:r>
+    </w:p>
+    <w:p>
+      <w:pPr>
+        <w:rPr>
+          <w:rFonts w:ascii="Times New Roman" w:hAnsi="Times New Roman" w:cs="Times New Roman"/>
+          <w:sz w:val="26"/>
+          <w:szCs w:val="26"/>
+        </w:rPr>
+      </w:pPr>
+      <w:r>
+        <w:rPr>
+          <w:rFonts w:ascii="Times New Roman" w:hAnsi="Times New Roman" w:cs="Times New Roman"/>
+          <w:sz w:val="26"/>
+          <w:szCs w:val="26"/>
+        </w:rPr>
+        <w:t>To generate HTTP traffic for analysis, open a browser and visit the following HTTP-based demo login page:</w:t>
+      </w:r>
+      <w:r>
+        <w:rPr>
+          <w:rFonts w:ascii="Times New Roman" w:hAnsi="Times New Roman" w:cs="Times New Roman"/>
+          <w:sz w:val="26"/>
+          <w:szCs w:val="26"/>
+        </w:rPr>
+        <w:t xml:space="preserve"> </w:t>
+      </w:r>
+      <w:r>
+        <w:rPr>
+          <w:rFonts w:ascii="Times New Roman" w:hAnsi="Times New Roman" w:cs="Times New Roman"/>
+          <w:sz w:val="26"/>
+          <w:szCs w:val="26"/>
+        </w:rPr>
+        <w:t>http://demo.testfire.net/login.jsp</w:t>
+      </w:r>
+    </w:p>
+    <w:p>
+      <w:pPr>
+        <w:rPr>
+          <w:rFonts w:ascii="Times New Roman" w:hAnsi="Times New Roman" w:cs="Times New Roman"/>
+          <w:sz w:val="26"/>
+          <w:szCs w:val="26"/>
+        </w:rPr>
+      </w:pPr>
+      <w:r>
+        <w:rPr>
+          <w:rFonts w:ascii="Times New Roman" w:hAnsi="Times New Roman" w:cs="Times New Roman"/>
+          <w:sz w:val="26"/>
+          <w:szCs w:val="26"/>
+        </w:rPr>
+        <w:t xml:space="preserve">Enter </w:t>
       </w:r>
       <w:r>
         <w:rPr>
           <w:rFonts w:ascii="Times New Roman" w:hAnsi="Times New Roman" w:cs="Times New Roman"/>
           <w:b/>
           <w:bCs/>
-          <w:sz w:val="28"/>
-          <w:szCs w:val="28"/>
-        </w:rPr>
-        <w:t xml:space="preserve">: Visit </w:t>
+          <w:sz w:val="26"/>
+          <w:szCs w:val="26"/>
+        </w:rPr>
+        <w:t>dummy credentials</w:t>
+      </w:r>
+      <w:r>
+        <w:rPr>
+          <w:rFonts w:ascii="Times New Roman" w:hAnsi="Times New Roman" w:cs="Times New Roman"/>
+          <w:sz w:val="26"/>
+          <w:szCs w:val="26"/>
+        </w:rPr>
+        <w:t xml:space="preserve"> in the login form and click </w:t>
       </w:r>
       <w:r>
         <w:rPr>
           <w:rFonts w:ascii="Times New Roman" w:hAnsi="Times New Roman" w:cs="Times New Roman"/>
           <w:b/>
           <w:bCs/>
-          <w:sz w:val="28"/>
-          <w:szCs w:val="28"/>
-        </w:rPr>
-        <w:t xml:space="preserve">HTTP </w:t>
-      </w:r>
-      <w:r>
-        <w:rPr>
-          <w:rFonts w:ascii="Times New Roman" w:hAnsi="Times New Roman" w:cs="Times New Roman"/>
-          <w:b/>
-          <w:bCs/>
-          <w:sz w:val="28"/>
-          <w:szCs w:val="28"/>
-        </w:rPr>
-        <w:t>Site</w:t>
-      </w:r>
-    </w:p>
-    <w:p>
-      <w:pPr>
-        <w:rPr>
-          <w:rFonts w:ascii="Times New Roman" w:hAnsi="Times New Roman" w:cs="Times New Roman"/>
-          <w:sz w:val="26"/>
-          <w:szCs w:val="26"/>
-        </w:rPr>
-      </w:pPr>
-      <w:r>
-        <w:rPr>
-          <w:rFonts w:ascii="Times New Roman" w:hAnsi="Times New Roman" w:cs="Times New Roman"/>
-          <w:sz w:val="26"/>
-          <w:szCs w:val="26"/>
-        </w:rPr>
-        <w:t>To generate HTTP traffic for analysis, open a browser and visit the following HTTP-based demo login page:</w:t>
-      </w:r>
-      <w:r>
-        <w:rPr>
-          <w:rFonts w:ascii="Times New Roman" w:hAnsi="Times New Roman" w:cs="Times New Roman"/>
-          <w:sz w:val="26"/>
-          <w:szCs w:val="26"/>
-        </w:rPr>
-        <w:t xml:space="preserve"> </w:t>
-      </w:r>
-      <w:r>
-        <w:rPr>
-          <w:rFonts w:ascii="Times New Roman" w:hAnsi="Times New Roman" w:cs="Times New Roman"/>
-          <w:sz w:val="26"/>
-          <w:szCs w:val="26"/>
-        </w:rPr>
-        <w:t>http://demo.testfire.net/login.jsp</w:t>
-      </w:r>
-    </w:p>
-    <w:p>
-      <w:pPr>
-        <w:rPr>
-          <w:rFonts w:ascii="Times New Roman" w:hAnsi="Times New Roman" w:cs="Times New Roman"/>
-          <w:sz w:val="26"/>
-          <w:szCs w:val="26"/>
-        </w:rPr>
-      </w:pPr>
-      <w:r>
-        <w:rPr>
-          <w:rFonts w:ascii="Times New Roman" w:hAnsi="Times New Roman" w:cs="Times New Roman"/>
+          <w:sz w:val="26"/>
+          <w:szCs w:val="26"/>
+        </w:rPr>
+        <w:t>Login</w:t>
+      </w:r>
+      <w:r>
+        <w:rPr>
+          <w:rFonts w:ascii="Times New Roman" w:hAnsi="Times New Roman" w:cs="Times New Roman"/>
+          <w:sz w:val="26"/>
+          <w:szCs w:val="26"/>
+        </w:rPr>
+        <w:t xml:space="preserve"> while Wireshark is capturing packets.</w:t>
+      </w:r>
+    </w:p>
+    <w:p>
+      <w:pPr>
+        <w:rPr>
+          <w:rFonts w:ascii="Times New Roman" w:hAnsi="Times New Roman" w:cs="Times New Roman"/>
+          <w:sz w:val="26"/>
+          <w:szCs w:val="26"/>
+        </w:rPr>
+      </w:pPr>
+    </w:p>
+    <w:p>
+      <w:pPr>
+        <w:keepNext/>
+      </w:pPr>
+      <w:r>
+        <w:rPr>
+          <w:rFonts w:ascii="Times New Roman" w:hAnsi="Times New Roman" w:cs="Times New Roman"/>
+          <w:noProof/>
           <w:sz w:val="26"/>
           <w:szCs w:val="26"/>
         </w:rPr>
         <w:lastRenderedPageBreak/>
-        <w:t xml:space="preserve">Enter </w:t>
-      </w:r>
-      <w:r>
-        <w:rPr>
-          <w:rFonts w:ascii="Times New Roman" w:hAnsi="Times New Roman" w:cs="Times New Roman"/>
-          <w:b/>
-          <w:bCs/>
-          <w:sz w:val="26"/>
-          <w:szCs w:val="26"/>
-        </w:rPr>
-        <w:t>dummy credentials</w:t>
-      </w:r>
-      <w:r>
-        <w:rPr>
-          <w:rFonts w:ascii="Times New Roman" w:hAnsi="Times New Roman" w:cs="Times New Roman"/>
-          <w:sz w:val="26"/>
-          <w:szCs w:val="26"/>
-        </w:rPr>
-        <w:t xml:space="preserve"> in the login form and click </w:t>
-      </w:r>
-      <w:r>
-        <w:rPr>
-          <w:rFonts w:ascii="Times New Roman" w:hAnsi="Times New Roman" w:cs="Times New Roman"/>
-          <w:b/>
-          <w:bCs/>
-          <w:sz w:val="26"/>
-          <w:szCs w:val="26"/>
-        </w:rPr>
-        <w:t>Login</w:t>
-      </w:r>
-      <w:r>
-        <w:rPr>
-          <w:rFonts w:ascii="Times New Roman" w:hAnsi="Times New Roman" w:cs="Times New Roman"/>
-          <w:sz w:val="26"/>
-          <w:szCs w:val="26"/>
-        </w:rPr>
-        <w:t xml:space="preserve"> while Wireshark is capturing packets.</w:t>
-      </w:r>
-    </w:p>
-    <w:p>
-      <w:pPr>
-        <w:rPr>
-          <w:rFonts w:ascii="Times New Roman" w:hAnsi="Times New Roman" w:cs="Times New Roman"/>
-          <w:sz w:val="26"/>
-          <w:szCs w:val="26"/>
-        </w:rPr>
-      </w:pPr>
-    </w:p>
-    <w:p>
-      <w:pPr>
-        <w:keepNext/>
-      </w:pPr>
-      <w:r>
-        <w:rPr>
-          <w:rFonts w:ascii="Times New Roman" w:hAnsi="Times New Roman" w:cs="Times New Roman"/>
-          <w:sz w:val="26"/>
-          <w:szCs w:val="26"/>
-        </w:rPr>
         <w:drawing>
           <wp:inline distT="0" distB="0" distL="0" distR="0" wp14:anchorId="3EAE3D52" wp14:editId="33DDDEB7">
             <wp:extent cx="5943600" cy="3343275"/>
@@ -3568,6 +3519,7 @@
       <w:r>
         <w:rPr>
           <w:rFonts w:ascii="Times New Roman" w:hAnsi="Times New Roman" w:cs="Times New Roman"/>
+          <w:noProof/>
           <w:sz w:val="26"/>
           <w:szCs w:val="26"/>
         </w:rPr>
@@ -3624,14 +3576,7 @@
           <w:sz w:val="22"/>
           <w:szCs w:val="22"/>
         </w:rPr>
-        <w:t>Screenshot 4:</w:t>
-      </w:r>
-      <w:r>
-        <w:rPr>
-          <w:sz w:val="22"/>
-          <w:szCs w:val="22"/>
-        </w:rPr>
-        <w:t xml:space="preserve"> Wireshark showing the filtered HTTP packets.</w:t>
+        <w:t>Screenshot 4: Wireshark showing the filtered HTTP packets.</w:t>
       </w:r>
     </w:p>
     <w:p>
@@ -3755,25 +3700,7 @@
           <w:sz w:val="26"/>
           <w:szCs w:val="26"/>
         </w:rPr>
-        <w:t>POST /</w:t>
-      </w:r>
-      <w:proofErr w:type="spellStart"/>
-      <w:r>
-        <w:rPr>
-          <w:rFonts w:ascii="Times New Roman" w:hAnsi="Times New Roman" w:cs="Times New Roman"/>
-          <w:sz w:val="26"/>
-          <w:szCs w:val="26"/>
-        </w:rPr>
-        <w:t>doLogin</w:t>
-      </w:r>
-      <w:proofErr w:type="spellEnd"/>
-      <w:r>
-        <w:rPr>
-          <w:rFonts w:ascii="Times New Roman" w:hAnsi="Times New Roman" w:cs="Times New Roman"/>
-          <w:sz w:val="26"/>
-          <w:szCs w:val="26"/>
-        </w:rPr>
-        <w:t xml:space="preserve"> HTTP/1.1</w:t>
+        <w:t>POST /doLogin HTTP/1.1</w:t>
       </w:r>
     </w:p>
     <w:p>
@@ -3931,6 +3858,7 @@
       <w:r>
         <w:rPr>
           <w:rFonts w:ascii="Times New Roman" w:hAnsi="Times New Roman" w:cs="Times New Roman"/>
+          <w:noProof/>
           <w:sz w:val="26"/>
           <w:szCs w:val="26"/>
         </w:rPr>
@@ -4086,25 +4014,7 @@
           <w:sz w:val="26"/>
           <w:szCs w:val="26"/>
         </w:rPr>
-        <w:t>Box POST /</w:t>
-      </w:r>
-      <w:proofErr w:type="spellStart"/>
-      <w:r>
-        <w:rPr>
-          <w:rFonts w:ascii="Times New Roman" w:hAnsi="Times New Roman" w:cs="Times New Roman"/>
-          <w:sz w:val="26"/>
-          <w:szCs w:val="26"/>
-        </w:rPr>
-        <w:t>doLogin</w:t>
-      </w:r>
-      <w:proofErr w:type="spellEnd"/>
-      <w:r>
-        <w:rPr>
-          <w:rFonts w:ascii="Times New Roman" w:hAnsi="Times New Roman" w:cs="Times New Roman"/>
-          <w:sz w:val="26"/>
-          <w:szCs w:val="26"/>
-        </w:rPr>
-        <w:t xml:space="preserve"> HTTP/1.1 in the packet details. </w:t>
+        <w:t xml:space="preserve">Box POST /doLogin HTTP/1.1 in the packet details. </w:t>
       </w:r>
     </w:p>
     <w:p>
@@ -4148,61 +4058,7 @@
           <w:sz w:val="26"/>
           <w:szCs w:val="26"/>
         </w:rPr>
-        <w:t xml:space="preserve">Box the </w:t>
-      </w:r>
-      <w:proofErr w:type="spellStart"/>
-      <w:r>
-        <w:rPr>
-          <w:rFonts w:ascii="Times New Roman" w:hAnsi="Times New Roman" w:cs="Times New Roman"/>
-          <w:sz w:val="26"/>
-          <w:szCs w:val="26"/>
-        </w:rPr>
-        <w:t>uid</w:t>
-      </w:r>
-      <w:proofErr w:type="spellEnd"/>
-      <w:r>
-        <w:rPr>
-          <w:rFonts w:ascii="Times New Roman" w:hAnsi="Times New Roman" w:cs="Times New Roman"/>
-          <w:sz w:val="26"/>
-          <w:szCs w:val="26"/>
-        </w:rPr>
-        <w:t xml:space="preserve"> = </w:t>
-      </w:r>
-      <w:proofErr w:type="spellStart"/>
-      <w:r>
-        <w:rPr>
-          <w:rFonts w:ascii="Times New Roman" w:hAnsi="Times New Roman" w:cs="Times New Roman"/>
-          <w:sz w:val="26"/>
-          <w:szCs w:val="26"/>
-        </w:rPr>
-        <w:t>vishal</w:t>
-      </w:r>
-      <w:proofErr w:type="spellEnd"/>
-      <w:r>
-        <w:rPr>
-          <w:rFonts w:ascii="Times New Roman" w:hAnsi="Times New Roman" w:cs="Times New Roman"/>
-          <w:sz w:val="26"/>
-          <w:szCs w:val="26"/>
-        </w:rPr>
-        <w:t xml:space="preserve"> and </w:t>
-      </w:r>
-      <w:proofErr w:type="spellStart"/>
-      <w:r>
-        <w:rPr>
-          <w:rFonts w:ascii="Times New Roman" w:hAnsi="Times New Roman" w:cs="Times New Roman"/>
-          <w:sz w:val="26"/>
-          <w:szCs w:val="26"/>
-        </w:rPr>
-        <w:t>passw</w:t>
-      </w:r>
-      <w:proofErr w:type="spellEnd"/>
-      <w:r>
-        <w:rPr>
-          <w:rFonts w:ascii="Times New Roman" w:hAnsi="Times New Roman" w:cs="Times New Roman"/>
-          <w:sz w:val="26"/>
-          <w:szCs w:val="26"/>
-        </w:rPr>
-        <w:t xml:space="preserve"> = 1234 values. </w:t>
+        <w:t xml:space="preserve">Box the uid = vishal and passw = 1234 values. </w:t>
       </w:r>
     </w:p>
     <w:p>
@@ -4286,25 +4142,7 @@
           <w:sz w:val="26"/>
           <w:szCs w:val="26"/>
         </w:rPr>
-        <w:t xml:space="preserve">Wireshark was successfully used to capture live network traffic and filter HTTP packets using the http display filter. The HTTP POST request was </w:t>
-      </w:r>
-      <w:proofErr w:type="spellStart"/>
-      <w:r>
-        <w:rPr>
-          <w:rFonts w:ascii="Times New Roman" w:hAnsi="Times New Roman" w:cs="Times New Roman"/>
-          <w:sz w:val="26"/>
-          <w:szCs w:val="26"/>
-        </w:rPr>
-        <w:t>analyzed</w:t>
-      </w:r>
-      <w:proofErr w:type="spellEnd"/>
-      <w:r>
-        <w:rPr>
-          <w:rFonts w:ascii="Times New Roman" w:hAnsi="Times New Roman" w:cs="Times New Roman"/>
-          <w:sz w:val="26"/>
-          <w:szCs w:val="26"/>
-        </w:rPr>
-        <w:t>, and the submitted dummy credentials were visible in the captured packet, demonstrating that credentials transmitted over unencrypted HTTP can be exposed during network traffic analysis.</w:t>
+        <w:t>Wireshark was successfully used to capture live network traffic and filter HTTP packets using the http display filter. The HTTP POST request was analyzed, and the submitted dummy credentials were visible in the captured packet, demonstrating that credentials transmitted over unencrypted HTTP can be exposed during network traffic analysis.</w:t>
       </w:r>
     </w:p>
     <w:p>
@@ -12306,6 +12144,7 @@
   <w:style w:type="character" w:default="1" w:styleId="DefaultParagraphFont">
     <w:name w:val="Default Paragraph Font"/>
     <w:uiPriority w:val="1"/>
+    <w:semiHidden/>
     <w:unhideWhenUsed/>
   </w:style>
   <w:style w:type="table" w:default="1" w:styleId="TableNormal">

</xml_diff>